<commit_message>
Changed the lab to satisfy the 1st variant
</commit_message>
<xml_diff>
--- a/serial_messenger/reports/Отчёт_Басюк_Алеся_Владимировна.docx
+++ b/serial_messenger/reports/Отчёт_Басюк_Алеся_Владимировна.docx
@@ -149,12 +149,7 @@
         <w:jc w:val="both"/>
       </w:pPr>
       <w:r>
-        <w:rPr>
-          <w:rFonts w:ascii="Times New Roman" w:hAnsi="Times New Roman" w:eastAsia="Times New Roman"/>
-          <w:b w:val="0"/>
-          <w:sz w:val="28"/>
-        </w:rPr>
-        <w:t>Вариант 3: выбирается количество стоп-битов; остальные параметры фиксированы. Передача выполняется посимвольно сразу после ввода.</w:t>
+        <w:t>Вариант 1: выбирается скорость передачи; длина байта 8, чётность None и 1 стоп-бит фиксированы. Передача выполняется посимвольно сразу после ввода.</w:t>
       </w:r>
     </w:p>
     <w:p>
@@ -207,12 +202,7 @@
         <w:jc w:val="both"/>
       </w:pPr>
       <w:r>
-        <w:rPr>
-          <w:rFonts w:ascii="Times New Roman" w:hAnsi="Times New Roman" w:eastAsia="Times New Roman"/>
-          <w:b w:val="0"/>
-          <w:sz w:val="28"/>
-        </w:rPr>
-        <w:t>Приложение написано на Python 3 с использованием PyQt6 и pyserial. Для открытия порта используется serial.Serial. Возможные значения baudrate: 110, 300, 600, 1200, 2400, 4800, 9600, 19200, 38400, 57600, 115200 и другие; в работе фиксировано 9600. bytesize может быть 5, 6, 7 или 8; в работе фиксировано 8. parity: N, E, O, M, S; в работе N. stopbits: 1, 1.5 или 2; в варианте 3 это выбираемый параметр. timeout и write_timeout задают тайм-ауты в секундах; используются 0.05 и 1.</w:t>
+        <w:t>Приложение написано на Python 3 с использованием PyQt6 и pyserial. Для открытия порта используется serial.Serial. Возможные значения baudrate: 110, 300, 600, 1200, 2400, 4800, 9600, 19200, 38400, 57600, 115200 и другие; в варианте 1 пользователь выбирает скорость. bytesize может быть 5, 6, 7 или 8; в работе фиксировано 8. parity: N, E, O, M, S; в работе N. stopbits: 1, 1.5 или 2; в работе фиксирован 1 стоп-бит. timeout и write_timeout задают тайм-ауты в секундах; используются 0.05 и 1.</w:t>
       </w:r>
     </w:p>
     <w:p>
@@ -319,12 +309,7 @@
         <w:jc w:val="both"/>
       </w:pPr>
       <w:r>
-        <w:rPr>
-          <w:rFonts w:ascii="Courier New" w:hAnsi="Courier New" w:eastAsia="Times New Roman"/>
-          <w:b w:val="0"/>
-          <w:sz w:val="20"/>
-        </w:rPr>
-        <w:t>form.addRow("Stop bits", self.stop_bits_choice)</w:t>
+        <w:t>form.addRow("Baud rate", self.baud_rate_choice)</w:t>
       </w:r>
     </w:p>
     <w:p>
@@ -348,12 +333,7 @@
         <w:jc w:val="both"/>
       </w:pPr>
       <w:r>
-        <w:rPr>
-          <w:rFonts w:ascii="Times New Roman" w:hAnsi="Times New Roman" w:eastAsia="Times New Roman"/>
-          <w:b w:val="0"/>
-          <w:sz w:val="28"/>
-        </w:rPr>
-        <w:t>В области Connection находятся ровно две формы: выбор COM-порта и выбор стоп-битов. Остальные требуемые области отделены визуально.</w:t>
+        <w:t>В области Connection находятся ровно две формы: выбор COM-порта и выбор скорости передачи. Остальные требуемые области отделены визуально.</w:t>
       </w:r>
     </w:p>
     <w:p>
@@ -377,12 +357,7 @@
         <w:jc w:val="both"/>
       </w:pPr>
       <w:r>
-        <w:rPr>
-          <w:rFonts w:ascii="Times New Roman" w:hAnsi="Times New Roman" w:eastAsia="Times New Roman"/>
-          <w:b w:val="0"/>
-          <w:sz w:val="28"/>
-        </w:rPr>
-        <w:t>Выполнена часть общей программы для варианта 3. Приложение обеспечивает циклический посимвольный обмен через COM-порт и отображает состояние передачи.</w:t>
+        <w:t>Выполнена часть общей программы для варианта 1. Приложение обеспечивает циклический посимвольный обмен через COM-порт при выбранной скорости и отображает состояние передачи.</w:t>
       </w:r>
     </w:p>
     <w:sectPr>

</xml_diff>